<commit_message>
Release 34 (GL-1): Greek lease takes its details from the tenant, the flat and Company Details - no past tenant's details in the template; Company Details (HE283373, passport) stored once, superuser only; migration 0113
Co-Authored-By: Claude Opus 5 <noreply@anthropic.com>
</commit_message>
<xml_diff>
--- a/pages/templates/lease_templates/greece_greek_lease_template.docx
+++ b/pages/templates/lease_templates/greece_greek_lease_template.docx
@@ -483,177 +483,155 @@
           <w:b w:val="0"/>
           <w:lang w:val="el-GR"/>
         </w:rPr>
-        <w:t>ΑΤ4635239</w:t>
-      </w:r>
-      <w:r>
-        <w:rPr>
-          <w:rFonts w:ascii="Arial" w:hAnsi="Arial" w:cs="Arial"/>
-          <w:b w:val="0"/>
-        </w:rPr>
-        <w:t xml:space="preserve"> </w:t>
-      </w:r>
-      <w:proofErr w:type="spellStart"/>
-      <w:r>
-        <w:rPr>
-          <w:rFonts w:ascii="Arial" w:hAnsi="Arial" w:cs="Arial"/>
-          <w:b w:val="0"/>
-        </w:rPr>
-        <w:t>με</w:t>
-      </w:r>
-      <w:proofErr w:type="spellEnd"/>
-      <w:r>
-        <w:rPr>
-          <w:rFonts w:ascii="Arial" w:hAnsi="Arial" w:cs="Arial"/>
-          <w:b w:val="0"/>
-        </w:rPr>
-        <w:t xml:space="preserve"> </w:t>
-      </w:r>
-      <w:proofErr w:type="spellStart"/>
-      <w:r>
-        <w:rPr>
-          <w:rFonts w:ascii="Arial" w:hAnsi="Arial" w:cs="Arial"/>
-          <w:b w:val="0"/>
-        </w:rPr>
-        <w:t>ημερομηνί</w:t>
-      </w:r>
-      <w:proofErr w:type="spellEnd"/>
-      <w:r>
-        <w:rPr>
-          <w:rFonts w:ascii="Arial" w:hAnsi="Arial" w:cs="Arial"/>
-          <w:b w:val="0"/>
-        </w:rPr>
-        <w:t xml:space="preserve">α </w:t>
-      </w:r>
-      <w:proofErr w:type="spellStart"/>
-      <w:r>
-        <w:rPr>
-          <w:rFonts w:ascii="Arial" w:hAnsi="Arial" w:cs="Arial"/>
-          <w:b w:val="0"/>
-        </w:rPr>
-        <w:t>έκδοσης</w:t>
-      </w:r>
-      <w:proofErr w:type="spellEnd"/>
-      <w:r>
-        <w:rPr>
-          <w:rFonts w:ascii="Arial" w:hAnsi="Arial" w:cs="Arial"/>
-          <w:b w:val="0"/>
-        </w:rPr>
-        <w:t xml:space="preserve"> 2</w:t>
-      </w:r>
-      <w:r>
-        <w:rPr>
-          <w:rFonts w:ascii="Arial" w:hAnsi="Arial" w:cs="Arial"/>
-          <w:b w:val="0"/>
-          <w:lang w:val="el-GR"/>
-        </w:rPr>
-        <w:t>6</w:t>
-      </w:r>
-      <w:r>
-        <w:rPr>
-          <w:rFonts w:ascii="Arial" w:hAnsi="Arial" w:cs="Arial"/>
-          <w:b w:val="0"/>
-        </w:rPr>
-        <w:t>-</w:t>
-      </w:r>
-      <w:r>
-        <w:rPr>
-          <w:rFonts w:ascii="Arial" w:hAnsi="Arial" w:cs="Arial"/>
-          <w:b w:val="0"/>
-          <w:lang w:val="el-GR"/>
-        </w:rPr>
-        <w:t>02</w:t>
-      </w:r>
-      <w:r>
-        <w:rPr>
-          <w:rFonts w:ascii="Arial" w:hAnsi="Arial" w:cs="Arial"/>
-          <w:b w:val="0"/>
-        </w:rPr>
-        <w:t>-20</w:t>
-      </w:r>
-      <w:r>
-        <w:rPr>
-          <w:rFonts w:ascii="Arial" w:hAnsi="Arial" w:cs="Arial"/>
-          <w:b w:val="0"/>
-          <w:lang w:val="el-GR"/>
-        </w:rPr>
-        <w:t>22</w:t>
-      </w:r>
-      <w:r>
-        <w:rPr>
-          <w:rFonts w:ascii="Arial" w:hAnsi="Arial" w:cs="Arial"/>
-          <w:b w:val="0"/>
-        </w:rPr>
-        <w:t xml:space="preserve"> και </w:t>
-      </w:r>
-      <w:proofErr w:type="spellStart"/>
-      <w:r>
-        <w:rPr>
-          <w:rFonts w:ascii="Arial" w:hAnsi="Arial" w:cs="Arial"/>
-          <w:b w:val="0"/>
-        </w:rPr>
-        <w:t>ημερομηνί</w:t>
-      </w:r>
-      <w:proofErr w:type="spellEnd"/>
-      <w:r>
-        <w:rPr>
-          <w:rFonts w:ascii="Arial" w:hAnsi="Arial" w:cs="Arial"/>
-          <w:b w:val="0"/>
-        </w:rPr>
-        <w:t xml:space="preserve">α </w:t>
-      </w:r>
-      <w:proofErr w:type="spellStart"/>
-      <w:r>
-        <w:rPr>
-          <w:rFonts w:ascii="Arial" w:hAnsi="Arial" w:cs="Arial"/>
-          <w:b w:val="0"/>
-        </w:rPr>
-        <w:t>λήξης</w:t>
-      </w:r>
-      <w:proofErr w:type="spellEnd"/>
-      <w:r>
-        <w:rPr>
-          <w:rFonts w:ascii="Arial" w:hAnsi="Arial" w:cs="Arial"/>
-          <w:b w:val="0"/>
-        </w:rPr>
-        <w:t xml:space="preserve"> 2</w:t>
-      </w:r>
-      <w:r>
-        <w:rPr>
-          <w:rFonts w:ascii="Arial" w:hAnsi="Arial" w:cs="Arial"/>
-          <w:b w:val="0"/>
-          <w:lang w:val="el-GR"/>
-        </w:rPr>
-        <w:t>5</w:t>
-      </w:r>
-      <w:r>
-        <w:rPr>
-          <w:rFonts w:ascii="Arial" w:hAnsi="Arial" w:cs="Arial"/>
-          <w:b w:val="0"/>
-        </w:rPr>
-        <w:t>-</w:t>
-      </w:r>
-      <w:r>
-        <w:rPr>
-          <w:rFonts w:ascii="Arial" w:hAnsi="Arial" w:cs="Arial"/>
-          <w:b w:val="0"/>
-          <w:lang w:val="el-GR"/>
-        </w:rPr>
-        <w:t>02</w:t>
-      </w:r>
-      <w:r>
-        <w:rPr>
-          <w:rFonts w:ascii="Arial" w:hAnsi="Arial" w:cs="Arial"/>
-          <w:b w:val="0"/>
-        </w:rPr>
-        <w:t>-202</w:t>
-      </w:r>
-      <w:r>
-        <w:rPr>
-          <w:rFonts w:ascii="Arial" w:hAnsi="Arial" w:cs="Arial"/>
-          <w:b w:val="0"/>
-          <w:lang w:val="el-GR"/>
-        </w:rPr>
-        <w:t>7</w:t>
+        <w:t>{{ landlord_passport_number }} με ημερομηνία έκδοσης {{ landlord_passport_issued }} και ημερομηνία λήξης {{ landlord_passport_expires }}</w:t>
+      </w:r>
+      <w:r>
+        <w:rPr>
+          <w:rFonts w:ascii="Arial" w:hAnsi="Arial" w:cs="Arial"/>
+          <w:b w:val="0"/>
+        </w:rPr>
+      </w:r>
+      <w:proofErr w:type="spellStart"/>
+      <w:r>
+        <w:rPr>
+          <w:rFonts w:ascii="Arial" w:hAnsi="Arial" w:cs="Arial"/>
+          <w:b w:val="0"/>
+        </w:rPr>
+      </w:r>
+      <w:proofErr w:type="spellEnd"/>
+      <w:r>
+        <w:rPr>
+          <w:rFonts w:ascii="Arial" w:hAnsi="Arial" w:cs="Arial"/>
+          <w:b w:val="0"/>
+        </w:rPr>
+      </w:r>
+      <w:proofErr w:type="spellStart"/>
+      <w:r>
+        <w:rPr>
+          <w:rFonts w:ascii="Arial" w:hAnsi="Arial" w:cs="Arial"/>
+          <w:b w:val="0"/>
+        </w:rPr>
+      </w:r>
+      <w:proofErr w:type="spellEnd"/>
+      <w:r>
+        <w:rPr>
+          <w:rFonts w:ascii="Arial" w:hAnsi="Arial" w:cs="Arial"/>
+          <w:b w:val="0"/>
+        </w:rPr>
+      </w:r>
+      <w:proofErr w:type="spellStart"/>
+      <w:r>
+        <w:rPr>
+          <w:rFonts w:ascii="Arial" w:hAnsi="Arial" w:cs="Arial"/>
+          <w:b w:val="0"/>
+        </w:rPr>
+      </w:r>
+      <w:proofErr w:type="spellEnd"/>
+      <w:r>
+        <w:rPr>
+          <w:rFonts w:ascii="Arial" w:hAnsi="Arial" w:cs="Arial"/>
+          <w:b w:val="0"/>
+        </w:rPr>
+      </w:r>
+      <w:r>
+        <w:rPr>
+          <w:rFonts w:ascii="Arial" w:hAnsi="Arial" w:cs="Arial"/>
+          <w:b w:val="0"/>
+          <w:lang w:val="el-GR"/>
+        </w:rPr>
+      </w:r>
+      <w:r>
+        <w:rPr>
+          <w:rFonts w:ascii="Arial" w:hAnsi="Arial" w:cs="Arial"/>
+          <w:b w:val="0"/>
+        </w:rPr>
+      </w:r>
+      <w:r>
+        <w:rPr>
+          <w:rFonts w:ascii="Arial" w:hAnsi="Arial" w:cs="Arial"/>
+          <w:b w:val="0"/>
+          <w:lang w:val="el-GR"/>
+        </w:rPr>
+      </w:r>
+      <w:r>
+        <w:rPr>
+          <w:rFonts w:ascii="Arial" w:hAnsi="Arial" w:cs="Arial"/>
+          <w:b w:val="0"/>
+        </w:rPr>
+      </w:r>
+      <w:r>
+        <w:rPr>
+          <w:rFonts w:ascii="Arial" w:hAnsi="Arial" w:cs="Arial"/>
+          <w:b w:val="0"/>
+          <w:lang w:val="el-GR"/>
+        </w:rPr>
+      </w:r>
+      <w:r>
+        <w:rPr>
+          <w:rFonts w:ascii="Arial" w:hAnsi="Arial" w:cs="Arial"/>
+          <w:b w:val="0"/>
+        </w:rPr>
+      </w:r>
+      <w:proofErr w:type="spellStart"/>
+      <w:r>
+        <w:rPr>
+          <w:rFonts w:ascii="Arial" w:hAnsi="Arial" w:cs="Arial"/>
+          <w:b w:val="0"/>
+        </w:rPr>
+      </w:r>
+      <w:proofErr w:type="spellEnd"/>
+      <w:r>
+        <w:rPr>
+          <w:rFonts w:ascii="Arial" w:hAnsi="Arial" w:cs="Arial"/>
+          <w:b w:val="0"/>
+        </w:rPr>
+      </w:r>
+      <w:proofErr w:type="spellStart"/>
+      <w:r>
+        <w:rPr>
+          <w:rFonts w:ascii="Arial" w:hAnsi="Arial" w:cs="Arial"/>
+          <w:b w:val="0"/>
+        </w:rPr>
+      </w:r>
+      <w:proofErr w:type="spellEnd"/>
+      <w:r>
+        <w:rPr>
+          <w:rFonts w:ascii="Arial" w:hAnsi="Arial" w:cs="Arial"/>
+          <w:b w:val="0"/>
+        </w:rPr>
+      </w:r>
+      <w:r>
+        <w:rPr>
+          <w:rFonts w:ascii="Arial" w:hAnsi="Arial" w:cs="Arial"/>
+          <w:b w:val="0"/>
+          <w:lang w:val="el-GR"/>
+        </w:rPr>
+      </w:r>
+      <w:r>
+        <w:rPr>
+          <w:rFonts w:ascii="Arial" w:hAnsi="Arial" w:cs="Arial"/>
+          <w:b w:val="0"/>
+        </w:rPr>
+      </w:r>
+      <w:r>
+        <w:rPr>
+          <w:rFonts w:ascii="Arial" w:hAnsi="Arial" w:cs="Arial"/>
+          <w:b w:val="0"/>
+          <w:lang w:val="el-GR"/>
+        </w:rPr>
+      </w:r>
+      <w:r>
+        <w:rPr>
+          <w:rFonts w:ascii="Arial" w:hAnsi="Arial" w:cs="Arial"/>
+          <w:b w:val="0"/>
+        </w:rPr>
+      </w:r>
+      <w:r>
+        <w:rPr>
+          <w:rFonts w:ascii="Arial" w:hAnsi="Arial" w:cs="Arial"/>
+          <w:b w:val="0"/>
+          <w:lang w:val="el-GR"/>
+        </w:rPr>
       </w:r>
       <w:r>
         <w:rPr>
@@ -1723,177 +1701,147 @@
           <w:b w:val="0"/>
           <w:lang w:val="el-GR"/>
         </w:rPr>
-        <w:t xml:space="preserve"> του </w:t>
-      </w:r>
-      <w:r>
-        <w:rPr>
-          <w:rFonts w:ascii="Arial" w:hAnsi="Arial" w:cs="Arial"/>
-          <w:b w:val="0"/>
-          <w:highlight w:val="yellow"/>
-          <w:lang w:val="el-GR"/>
-        </w:rPr>
-        <w:t>Λαζάρου</w:t>
-      </w:r>
-      <w:r>
-        <w:rPr>
-          <w:rFonts w:ascii="Arial" w:hAnsi="Arial" w:cs="Arial"/>
-          <w:b w:val="0"/>
-        </w:rPr>
-        <w:t>,</w:t>
-      </w:r>
-      <w:r>
-        <w:rPr>
-          <w:rFonts w:ascii="Arial" w:hAnsi="Arial" w:cs="Arial"/>
-        </w:rPr>
-        <w:t xml:space="preserve"> </w:t>
-      </w:r>
-      <w:proofErr w:type="spellStart"/>
-      <w:r>
-        <w:rPr>
-          <w:rFonts w:ascii="Arial" w:hAnsi="Arial" w:cs="Arial"/>
-          <w:b w:val="0"/>
-        </w:rPr>
-        <w:t>κάτοικο</w:t>
-      </w:r>
-      <w:r>
-        <w:rPr>
-          <w:rFonts w:ascii="Arial" w:hAnsi="Arial" w:cs="Arial"/>
-          <w:b w:val="0"/>
-          <w:lang w:val="el-GR"/>
-        </w:rPr>
-        <w:t>ς</w:t>
-      </w:r>
-      <w:proofErr w:type="spellEnd"/>
-      <w:r>
-        <w:rPr>
-          <w:rFonts w:ascii="Arial" w:hAnsi="Arial" w:cs="Arial"/>
-          <w:b w:val="0"/>
-          <w:lang w:val="el-GR"/>
-        </w:rPr>
-        <w:t xml:space="preserve"> </w:t>
-      </w:r>
-      <w:r>
-        <w:rPr>
-          <w:rFonts w:ascii="Arial" w:hAnsi="Arial" w:cs="Arial"/>
-          <w:b w:val="0"/>
-          <w:highlight w:val="yellow"/>
-          <w:lang w:val="el-GR"/>
-        </w:rPr>
-        <w:t>Ψυχικού</w:t>
-      </w:r>
-      <w:r>
-        <w:rPr>
-          <w:rFonts w:ascii="Arial" w:hAnsi="Arial" w:cs="Arial"/>
-          <w:b w:val="0"/>
-          <w:highlight w:val="yellow"/>
-        </w:rPr>
-        <w:t xml:space="preserve">, </w:t>
-      </w:r>
-      <w:proofErr w:type="spellStart"/>
-      <w:r>
-        <w:rPr>
-          <w:rFonts w:ascii="Arial" w:hAnsi="Arial" w:cs="Arial"/>
-          <w:b w:val="0"/>
-          <w:highlight w:val="yellow"/>
-        </w:rPr>
-        <w:t>οδός</w:t>
-      </w:r>
-      <w:proofErr w:type="spellEnd"/>
-      <w:r>
-        <w:rPr>
-          <w:rFonts w:ascii="Arial" w:hAnsi="Arial" w:cs="Arial"/>
-          <w:b w:val="0"/>
-          <w:highlight w:val="yellow"/>
-        </w:rPr>
-        <w:t xml:space="preserve"> </w:t>
-      </w:r>
-      <w:r>
-        <w:rPr>
-          <w:rFonts w:ascii="Arial" w:hAnsi="Arial" w:cs="Arial"/>
-          <w:b w:val="0"/>
-          <w:highlight w:val="yellow"/>
-          <w:lang w:val="el-GR"/>
-        </w:rPr>
-        <w:t xml:space="preserve">Αφαίας </w:t>
-      </w:r>
-      <w:r>
-        <w:rPr>
-          <w:rFonts w:ascii="Arial" w:hAnsi="Arial" w:cs="Arial"/>
-          <w:b w:val="0"/>
-          <w:highlight w:val="yellow"/>
-        </w:rPr>
-        <w:t>αρ. 1</w:t>
-      </w:r>
-      <w:r>
-        <w:rPr>
-          <w:rFonts w:ascii="Arial" w:hAnsi="Arial" w:cs="Arial"/>
-          <w:b w:val="0"/>
-          <w:highlight w:val="yellow"/>
-          <w:lang w:val="el-GR"/>
-        </w:rPr>
-        <w:t>5</w:t>
-      </w:r>
-      <w:r>
-        <w:rPr>
-          <w:rFonts w:ascii="Arial" w:hAnsi="Arial" w:cs="Arial"/>
-          <w:b w:val="0"/>
-        </w:rPr>
-        <w:t xml:space="preserve">, </w:t>
-      </w:r>
-      <w:proofErr w:type="spellStart"/>
-      <w:r>
-        <w:rPr>
-          <w:rFonts w:ascii="Arial" w:hAnsi="Arial" w:cs="Arial"/>
-          <w:b w:val="0"/>
-        </w:rPr>
-        <w:t>με</w:t>
-      </w:r>
-      <w:proofErr w:type="spellEnd"/>
-      <w:r>
-        <w:rPr>
-          <w:rFonts w:ascii="Arial" w:hAnsi="Arial" w:cs="Arial"/>
-          <w:b w:val="0"/>
-        </w:rPr>
-        <w:t xml:space="preserve"> Α.Φ.Μ.</w:t>
-      </w:r>
-      <w:r>
-        <w:rPr>
-          <w:rFonts w:ascii="Arial" w:hAnsi="Arial" w:cs="Arial"/>
-          <w:b w:val="0"/>
-          <w:lang w:val="el-GR"/>
-        </w:rPr>
-        <w:t>:</w:t>
-      </w:r>
-      <w:r>
-        <w:rPr>
-          <w:rFonts w:ascii="Arial" w:hAnsi="Arial" w:cs="Arial"/>
-          <w:b w:val="0"/>
-        </w:rPr>
-        <w:t xml:space="preserve"> </w:t>
-      </w:r>
-      <w:r>
-        <w:rPr>
-          <w:rFonts w:ascii="Arial" w:hAnsi="Arial" w:cs="Arial"/>
-          <w:b w:val="0"/>
-          <w:highlight w:val="yellow"/>
-          <w:lang w:val="el-GR"/>
-        </w:rPr>
-        <w:t>043454060</w:t>
-      </w:r>
-      <w:r>
-        <w:rPr>
-          <w:rFonts w:ascii="Arial" w:hAnsi="Arial" w:cs="Arial"/>
-          <w:b w:val="0"/>
-          <w:lang w:val="el-GR"/>
-        </w:rPr>
-        <w:t>,</w:t>
-      </w:r>
-      <w:r>
-        <w:rPr>
-          <w:rFonts w:ascii="Arial" w:hAnsi="Arial" w:cs="Arial"/>
-          <w:b w:val="0"/>
-        </w:rPr>
-        <w:t xml:space="preserve"> </w:t>
+        <w:t xml:space="preserve"> του {{ tenant_father_name }}, κάτοικος {{ tenant_address }}, με Α.Φ.Μ.: {{ tenant_afm }}, ΔΟΥ: {{ tenant_doy }}</w:t>
+      </w:r>
+      <w:r>
+        <w:rPr>
+          <w:rFonts w:ascii="Arial" w:hAnsi="Arial" w:cs="Arial"/>
+          <w:b w:val="0"/>
+          <w:lang w:val="el-GR"/>
+        </w:rPr>
+      </w:r>
+      <w:r>
+        <w:rPr>
+          <w:rFonts w:ascii="Arial" w:hAnsi="Arial" w:cs="Arial"/>
+          <w:b w:val="0"/>
+        </w:rPr>
+      </w:r>
+      <w:r>
+        <w:rPr>
+          <w:rFonts w:ascii="Arial" w:hAnsi="Arial" w:cs="Arial"/>
+        </w:rPr>
+      </w:r>
+      <w:proofErr w:type="spellStart"/>
+      <w:r>
+        <w:rPr>
+          <w:rFonts w:ascii="Arial" w:hAnsi="Arial" w:cs="Arial"/>
+          <w:b w:val="0"/>
+        </w:rPr>
+      </w:r>
+      <w:r>
+        <w:rPr>
+          <w:rFonts w:ascii="Arial" w:hAnsi="Arial" w:cs="Arial"/>
+          <w:b w:val="0"/>
+          <w:lang w:val="el-GR"/>
+        </w:rPr>
+      </w:r>
+      <w:proofErr w:type="spellEnd"/>
+      <w:r>
+        <w:rPr>
+          <w:rFonts w:ascii="Arial" w:hAnsi="Arial" w:cs="Arial"/>
+          <w:b w:val="0"/>
+          <w:lang w:val="el-GR"/>
+        </w:rPr>
+      </w:r>
+      <w:r>
+        <w:rPr>
+          <w:rFonts w:ascii="Arial" w:hAnsi="Arial" w:cs="Arial"/>
+          <w:b w:val="0"/>
+          <w:lang w:val="el-GR"/>
+        </w:rPr>
+      </w:r>
+      <w:r>
+        <w:rPr>
+          <w:rFonts w:ascii="Arial" w:hAnsi="Arial" w:cs="Arial"/>
+          <w:b w:val="0"/>
+        </w:rPr>
+      </w:r>
+      <w:proofErr w:type="spellStart"/>
+      <w:r>
+        <w:rPr>
+          <w:rFonts w:ascii="Arial" w:hAnsi="Arial" w:cs="Arial"/>
+          <w:b w:val="0"/>
+        </w:rPr>
+      </w:r>
+      <w:proofErr w:type="spellEnd"/>
+      <w:r>
+        <w:rPr>
+          <w:rFonts w:ascii="Arial" w:hAnsi="Arial" w:cs="Arial"/>
+          <w:b w:val="0"/>
+        </w:rPr>
+      </w:r>
+      <w:r>
+        <w:rPr>
+          <w:rFonts w:ascii="Arial" w:hAnsi="Arial" w:cs="Arial"/>
+          <w:b w:val="0"/>
+          <w:lang w:val="el-GR"/>
+        </w:rPr>
+      </w:r>
+      <w:r>
+        <w:rPr>
+          <w:rFonts w:ascii="Arial" w:hAnsi="Arial" w:cs="Arial"/>
+          <w:b w:val="0"/>
+        </w:rPr>
+      </w:r>
+      <w:r>
+        <w:rPr>
+          <w:rFonts w:ascii="Arial" w:hAnsi="Arial" w:cs="Arial"/>
+          <w:b w:val="0"/>
+          <w:lang w:val="el-GR"/>
+        </w:rPr>
+      </w:r>
+      <w:r>
+        <w:rPr>
+          <w:rFonts w:ascii="Arial" w:hAnsi="Arial" w:cs="Arial"/>
+          <w:b w:val="0"/>
+        </w:rPr>
+      </w:r>
+      <w:proofErr w:type="spellStart"/>
+      <w:r>
+        <w:rPr>
+          <w:rFonts w:ascii="Arial" w:hAnsi="Arial" w:cs="Arial"/>
+          <w:b w:val="0"/>
+        </w:rPr>
+      </w:r>
+      <w:proofErr w:type="spellEnd"/>
+      <w:r>
+        <w:rPr>
+          <w:rFonts w:ascii="Arial" w:hAnsi="Arial" w:cs="Arial"/>
+          <w:b w:val="0"/>
+        </w:rPr>
+      </w:r>
+      <w:r>
+        <w:rPr>
+          <w:rFonts w:ascii="Arial" w:hAnsi="Arial" w:cs="Arial"/>
+          <w:b w:val="0"/>
+          <w:lang w:val="el-GR"/>
+        </w:rPr>
+      </w:r>
+      <w:r>
+        <w:rPr>
+          <w:rFonts w:ascii="Arial" w:hAnsi="Arial" w:cs="Arial"/>
+          <w:b w:val="0"/>
+        </w:rPr>
+      </w:r>
+      <w:r>
+        <w:rPr>
+          <w:rFonts w:ascii="Arial" w:hAnsi="Arial" w:cs="Arial"/>
+          <w:b w:val="0"/>
+          <w:lang w:val="el-GR"/>
+        </w:rPr>
+      </w:r>
+      <w:r>
+        <w:rPr>
+          <w:rFonts w:ascii="Arial" w:hAnsi="Arial" w:cs="Arial"/>
+          <w:b w:val="0"/>
+          <w:lang w:val="el-GR"/>
+        </w:rPr>
+      </w:r>
+      <w:r>
+        <w:rPr>
+          <w:rFonts w:ascii="Arial" w:hAnsi="Arial" w:cs="Arial"/>
+          <w:b w:val="0"/>
+        </w:rPr>
       </w:r>
       <w:r>
         <w:rPr>
@@ -1901,7 +1849,6 @@
           <w:b w:val="0"/>
           <w:color w:val="000000"/>
         </w:rPr>
-        <w:t>ΔΟΥ</w:t>
       </w:r>
       <w:r>
         <w:rPr>
@@ -1910,7 +1857,6 @@
           <w:color w:val="000000"/>
           <w:lang w:val="el-GR"/>
         </w:rPr>
-        <w:t>:</w:t>
       </w:r>
       <w:r>
         <w:rPr>
@@ -1918,17 +1864,14 @@
           <w:b w:val="0"/>
           <w:color w:val="000000"/>
         </w:rPr>
-        <w:t xml:space="preserve"> </w:t>
       </w:r>
       <w:r>
         <w:rPr>
           <w:rFonts w:ascii="Arial" w:hAnsi="Arial" w:cs="Arial"/>
           <w:b w:val="0"/>
           <w:color w:val="000000"/>
-          <w:highlight w:val="yellow"/>
-          <w:lang w:val="el-GR"/>
-        </w:rPr>
-        <w:t>Χολαργού</w:t>
+          <w:lang w:val="el-GR"/>
+        </w:rPr>
       </w:r>
       <w:r>
         <w:rPr>
@@ -2153,31 +2096,27 @@
           <w:rFonts w:ascii="Arial" w:hAnsi="Arial" w:cs="Arial"/>
           <w:lang w:val="el-GR"/>
         </w:rPr>
-        <w:t xml:space="preserve"> του </w:t>
-      </w:r>
-      <w:r>
-        <w:rPr>
-          <w:rFonts w:ascii="Arial" w:hAnsi="Arial" w:cs="Arial"/>
-          <w:highlight w:val="yellow"/>
-          <w:lang w:val="el-GR"/>
-        </w:rPr>
-        <w:t>3</w:t>
-      </w:r>
-      <w:r>
-        <w:rPr>
-          <w:rFonts w:ascii="Arial" w:hAnsi="Arial" w:cs="Arial"/>
-          <w:highlight w:val="yellow"/>
+        <w:t xml:space="preserve"> του {{ property_floor_greek }} ορόφου</w:t>
+      </w:r>
+      <w:r>
+        <w:rPr>
+          <w:rFonts w:ascii="Arial" w:hAnsi="Arial" w:cs="Arial"/>
+          <w:lang w:val="el-GR"/>
+        </w:rPr>
+      </w:r>
+      <w:r>
+        <w:rPr>
+          <w:rFonts w:ascii="Arial" w:hAnsi="Arial" w:cs="Arial"/>
           <w:vertAlign w:val="superscript"/>
           <w:lang w:val="el-GR"/>
         </w:rPr>
-        <w:t>ου</w:t>
-      </w:r>
-      <w:r>
-        <w:rPr>
-          <w:rFonts w:ascii="Arial" w:hAnsi="Arial" w:cs="Arial"/>
-          <w:lang w:val="el-GR"/>
-        </w:rPr>
-        <w:t xml:space="preserve"> ορόφου σε πολυκατοικία που βρίσκεται στο Παλαιό Ψυχικ</w:t>
+      </w:r>
+      <w:r>
+        <w:rPr>
+          <w:rFonts w:ascii="Arial" w:hAnsi="Arial" w:cs="Arial"/>
+          <w:lang w:val="el-GR"/>
+        </w:rPr>
+        <w:t xml:space="preserve"> σε πολυκατοικία που βρίσκεται στο Παλαιό Ψυχικ</w:t>
       </w:r>
       <w:r>
         <w:rPr>
@@ -2263,23 +2202,19 @@
           <w:rFonts w:ascii="Arial" w:hAnsi="Arial" w:cs="Arial"/>
           <w:lang w:val="el-GR"/>
         </w:rPr>
-        <w:t xml:space="preserve">. ξένων, δύο υπνοδωμάτια, ένα ξενώνα και τρεις βεράντες. Το ακίνητο έχει και σε αποκλειστική χρήση μία αποθήκη, καθώς και ένα χώρο στάθμευσης αυτοκινήτου με αριθμό </w:t>
-      </w:r>
-      <w:r>
-        <w:rPr>
-          <w:rFonts w:ascii="Arial" w:hAnsi="Arial" w:cs="Arial"/>
-          <w:highlight w:val="yellow"/>
+        <w:t>. ξένων, δύο υπνοδωμάτια, ένα ξενώνα και τρεις βεράντες. Το ακίνητο έχει και σε αποκλειστική χρήση μία αποθήκη, καθώς και ένα χώρο στάθμευσης αυτοκινήτου με αριθμό {{ property_parking_space }} στον</w:t>
+      </w:r>
+      <w:r>
+        <w:rPr>
+          <w:rFonts w:ascii="Arial" w:hAnsi="Arial" w:cs="Arial"/>
           <w:lang w:val="en-US"/>
         </w:rPr>
-        <w:t>P</w:t>
-      </w:r>
-      <w:r>
-        <w:rPr>
-          <w:rFonts w:ascii="Arial" w:hAnsi="Arial" w:cs="Arial"/>
-          <w:highlight w:val="yellow"/>
-          <w:lang w:val="el-GR"/>
-        </w:rPr>
-        <w:t>3</w:t>
+      </w:r>
+      <w:r>
+        <w:rPr>
+          <w:rFonts w:ascii="Arial" w:hAnsi="Arial" w:cs="Arial"/>
+          <w:lang w:val="el-GR"/>
+        </w:rPr>
       </w:r>
       <w:r>
         <w:rPr>
@@ -2287,14 +2222,13 @@
           <w:color w:val="FF0000"/>
           <w:lang w:val="el-GR"/>
         </w:rPr>
-        <w:t xml:space="preserve"> </w:t>
-      </w:r>
-      <w:r>
-        <w:rPr>
-          <w:rFonts w:ascii="Arial" w:hAnsi="Arial" w:cs="Arial"/>
-          <w:lang w:val="el-GR"/>
-        </w:rPr>
-        <w:t>στον πίσω χώρο του οικοπέδου</w:t>
+      </w:r>
+      <w:r>
+        <w:rPr>
+          <w:rFonts w:ascii="Arial" w:hAnsi="Arial" w:cs="Arial"/>
+          <w:lang w:val="el-GR"/>
+        </w:rPr>
+        <w:t xml:space="preserve"> πίσω χώρο του οικοπέδου</w:t>
       </w:r>
       <w:r>
         <w:rPr>
@@ -2529,22 +2463,20 @@
           <w:rFonts w:ascii="Arial" w:hAnsi="Arial" w:cs="Arial"/>
           <w:lang w:val="el-GR"/>
         </w:rPr>
-        <w:t xml:space="preserve"> Η χρονική διάρκεια της μίσθωσης συμφωνείται για </w:t>
-      </w:r>
-      <w:r>
-        <w:rPr>
-          <w:rFonts w:ascii="Arial" w:hAnsi="Arial" w:cs="Arial"/>
-          <w:highlight w:val="yellow"/>
-          <w:lang w:val="el-GR"/>
-        </w:rPr>
-        <w:t>δύο (2)</w:t>
-      </w:r>
-      <w:r>
-        <w:rPr>
-          <w:rFonts w:ascii="Arial" w:hAnsi="Arial" w:cs="Arial"/>
-          <w:lang w:val="el-GR"/>
-        </w:rPr>
-        <w:t xml:space="preserve"> έτη. Αρχίζει από την </w:t>
+        <w:t xml:space="preserve"> Η χρονική διάρκεια της μίσθωσης συμφωνείται για {{ lease_term_greek }}.</w:t>
+      </w:r>
+      <w:r>
+        <w:rPr>
+          <w:rFonts w:ascii="Arial" w:hAnsi="Arial" w:cs="Arial"/>
+          <w:lang w:val="el-GR"/>
+        </w:rPr>
+      </w:r>
+      <w:r>
+        <w:rPr>
+          <w:rFonts w:ascii="Arial" w:hAnsi="Arial" w:cs="Arial"/>
+          <w:lang w:val="el-GR"/>
+        </w:rPr>
+        <w:t xml:space="preserve"> Αρχίζει από την </w:t>
       </w:r>
       <w:r>
         <w:rPr>
@@ -2677,28 +2609,26 @@
           <w:rFonts w:ascii="Arial" w:hAnsi="Arial" w:cs="Arial"/>
           <w:lang w:val="el-GR"/>
         </w:rPr>
-        <w:t xml:space="preserve"> με τους ίδιους επακριβώς όρους</w:t>
-      </w:r>
-      <w:r>
-        <w:rPr>
-          <w:rFonts w:ascii="Arial" w:hAnsi="Arial" w:cs="Arial"/>
-          <w:lang w:val="el-GR"/>
-        </w:rPr>
-        <w:t>,</w:t>
-      </w:r>
-      <w:r>
-        <w:rPr>
-          <w:rFonts w:ascii="Arial" w:hAnsi="Arial" w:cs="Arial"/>
-          <w:lang w:val="el-GR"/>
-        </w:rPr>
-        <w:t xml:space="preserve"> πλην των όσων αναφέρονται στον όρο 3 αναφορικά με το ύψος του μισθώματος για το τρίτο μισθωτικό έτος</w:t>
-      </w:r>
-      <w:r>
-        <w:rPr>
-          <w:rFonts w:ascii="Arial" w:hAnsi="Arial" w:cs="Arial"/>
-          <w:lang w:val="el-GR"/>
-        </w:rPr>
-        <w:t xml:space="preserve">. Μόλις λήξει ο χρόνος διάρκειας της μίσθωσης, </w:t>
+        <w:t xml:space="preserve"> με τους ίδιους επακριβώς όρους{% if third_year_rent %}, πλην των όσων αναφέρονται στον όρο 3 αναφορικά με το ύψος του μισθώματος για {{ next_period_greek }}{% endif %}.</w:t>
+      </w:r>
+      <w:r>
+        <w:rPr>
+          <w:rFonts w:ascii="Arial" w:hAnsi="Arial" w:cs="Arial"/>
+          <w:lang w:val="el-GR"/>
+        </w:rPr>
+      </w:r>
+      <w:r>
+        <w:rPr>
+          <w:rFonts w:ascii="Arial" w:hAnsi="Arial" w:cs="Arial"/>
+          <w:lang w:val="el-GR"/>
+        </w:rPr>
+      </w:r>
+      <w:r>
+        <w:rPr>
+          <w:rFonts w:ascii="Arial" w:hAnsi="Arial" w:cs="Arial"/>
+          <w:lang w:val="el-GR"/>
+        </w:rPr>
+        <w:t xml:space="preserve"> Μόλις λήξει ο χρόνος διάρκειας της μίσθωσης, </w:t>
       </w:r>
       <w:r>
         <w:rPr>
@@ -2820,22 +2750,20 @@
           <w:rFonts w:ascii="Arial" w:hAnsi="Arial" w:cs="Arial"/>
           <w:lang w:val="el-GR"/>
         </w:rPr>
-        <w:t xml:space="preserve">για τα πρώτα </w:t>
-      </w:r>
-      <w:r>
-        <w:rPr>
-          <w:rFonts w:ascii="Arial" w:hAnsi="Arial" w:cs="Arial"/>
-          <w:highlight w:val="yellow"/>
-          <w:lang w:val="el-GR"/>
-        </w:rPr>
-        <w:t>δύο (2)</w:t>
-      </w:r>
-      <w:r>
-        <w:rPr>
-          <w:rFonts w:ascii="Arial" w:hAnsi="Arial" w:cs="Arial"/>
-          <w:lang w:val="el-GR"/>
-        </w:rPr>
-        <w:t xml:space="preserve"> μισθωτικά έτη ήτοι για το χρονικό διάστημα από την </w:t>
+        <w:t>για {{ lease_term_rent_greek }} ήτοι</w:t>
+      </w:r>
+      <w:r>
+        <w:rPr>
+          <w:rFonts w:ascii="Arial" w:hAnsi="Arial" w:cs="Arial"/>
+          <w:lang w:val="el-GR"/>
+        </w:rPr>
+      </w:r>
+      <w:r>
+        <w:rPr>
+          <w:rFonts w:ascii="Arial" w:hAnsi="Arial" w:cs="Arial"/>
+          <w:lang w:val="el-GR"/>
+        </w:rPr>
+        <w:t xml:space="preserve"> για το χρονικό διάστημα από την </w:t>
       </w:r>
       <w:r>
         <w:rPr>
@@ -2941,126 +2869,105 @@
           <w:rFonts w:ascii="Arial" w:hAnsi="Arial" w:cs="Arial"/>
           <w:lang w:val="el-GR"/>
         </w:rPr>
-        <w:t>,</w:t>
-      </w:r>
-      <w:r>
-        <w:rPr>
-          <w:rFonts w:ascii="Arial" w:hAnsi="Arial" w:cs="Arial"/>
-          <w:lang w:val="el-GR"/>
-        </w:rPr>
-        <w:t xml:space="preserve"> ενώ για το τρίτο μισθωτικό έτος ήτοι από την </w:t>
-      </w:r>
-      <w:r>
-        <w:rPr>
-          <w:rFonts w:ascii="Arial" w:hAnsi="Arial" w:cs="Arial"/>
-          <w:highlight w:val="yellow"/>
-          <w:lang w:val="el-GR"/>
-        </w:rPr>
-        <w:t>1.12.2023</w:t>
-      </w:r>
-      <w:r>
-        <w:rPr>
-          <w:rFonts w:ascii="Arial" w:hAnsi="Arial" w:cs="Arial"/>
-          <w:lang w:val="el-GR"/>
-        </w:rPr>
-        <w:t xml:space="preserve"> έως την</w:t>
-      </w:r>
-      <w:r>
-        <w:rPr>
-          <w:rFonts w:ascii="Arial" w:hAnsi="Arial" w:cs="Arial"/>
-          <w:lang w:val="el-GR"/>
-        </w:rPr>
-        <w:t xml:space="preserve"> </w:t>
-      </w:r>
-      <w:r>
-        <w:rPr>
-          <w:rFonts w:ascii="Arial" w:hAnsi="Arial" w:cs="Arial"/>
-          <w:lang w:val="el-GR"/>
-        </w:rPr>
-        <w:t xml:space="preserve">{{ </w:t>
-      </w:r>
-      <w:proofErr w:type="spellStart"/>
-      <w:r>
-        <w:rPr>
-          <w:rFonts w:ascii="Arial" w:hAnsi="Arial" w:cs="Arial"/>
-          <w:lang w:val="el-GR"/>
-        </w:rPr>
-        <w:t>lease_extension_date_greek</w:t>
-      </w:r>
-      <w:proofErr w:type="spellEnd"/>
-      <w:r>
-        <w:rPr>
-          <w:rFonts w:ascii="Arial" w:hAnsi="Arial" w:cs="Arial"/>
-          <w:lang w:val="el-GR"/>
-        </w:rPr>
-        <w:t xml:space="preserve"> }}</w:t>
-      </w:r>
-      <w:r>
-        <w:rPr>
-          <w:rFonts w:ascii="Arial" w:hAnsi="Arial" w:cs="Arial"/>
-          <w:lang w:val="el-GR"/>
-        </w:rPr>
-        <w:t xml:space="preserve"> στο ποσό των </w:t>
-      </w:r>
-      <w:r>
-        <w:rPr>
-          <w:rFonts w:ascii="Arial" w:hAnsi="Arial" w:cs="Arial"/>
-          <w:b/>
-          <w:highlight w:val="yellow"/>
-          <w:lang w:val="el-GR"/>
-        </w:rPr>
-        <w:t>χ</w:t>
-      </w:r>
-      <w:r>
-        <w:rPr>
-          <w:rFonts w:ascii="Arial" w:hAnsi="Arial" w:cs="Arial"/>
-          <w:b/>
-          <w:highlight w:val="yellow"/>
-          <w:lang w:val="el-GR"/>
-        </w:rPr>
-        <w:t>ιλίων</w:t>
-      </w:r>
-      <w:r>
-        <w:rPr>
-          <w:rFonts w:ascii="Arial" w:hAnsi="Arial" w:cs="Arial"/>
-          <w:b/>
-          <w:highlight w:val="yellow"/>
-          <w:lang w:val="el-GR"/>
-        </w:rPr>
-        <w:t xml:space="preserve"> ευρώ (</w:t>
-      </w:r>
-      <w:r>
-        <w:rPr>
-          <w:rFonts w:ascii="Arial" w:hAnsi="Arial" w:cs="Arial"/>
-          <w:b/>
-          <w:highlight w:val="yellow"/>
-          <w:lang w:val="el-GR"/>
-        </w:rPr>
-        <w:t>1.0</w:t>
-      </w:r>
-      <w:r>
-        <w:rPr>
-          <w:rFonts w:ascii="Arial" w:hAnsi="Arial" w:cs="Arial"/>
-          <w:b/>
-          <w:highlight w:val="yellow"/>
-          <w:lang w:val="el-GR"/>
-        </w:rPr>
-        <w:t>00)</w:t>
-      </w:r>
-      <w:r>
-        <w:rPr>
-          <w:rFonts w:ascii="Arial" w:hAnsi="Arial" w:cs="Arial"/>
-          <w:b/>
-          <w:lang w:val="el-GR"/>
-        </w:rPr>
-        <w:t xml:space="preserve"> Ευρώ.</w:t>
-      </w:r>
-      <w:r>
-        <w:rPr>
-          <w:rFonts w:ascii="Arial" w:hAnsi="Arial" w:cs="Arial"/>
-          <w:lang w:val="el-GR"/>
-        </w:rPr>
-        <w:t xml:space="preserve"> </w:t>
+        <w:t>{% if third_year_rent %}, ενώ για {{ next_period_greek }} ήτοι από την {{ third_year_start_greek }} έως την {{ lease_extension_date_greek }} στο ποσό των €{{ third_year_rent }} ({{ third_year_rent_words_greek }} Ευρώ){% endif %}.</w:t>
+      </w:r>
+      <w:r>
+        <w:rPr>
+          <w:rFonts w:ascii="Arial" w:hAnsi="Arial" w:cs="Arial"/>
+          <w:lang w:val="el-GR"/>
+        </w:rPr>
+      </w:r>
+      <w:r>
+        <w:rPr>
+          <w:rFonts w:ascii="Arial" w:hAnsi="Arial" w:cs="Arial"/>
+          <w:lang w:val="el-GR"/>
+        </w:rPr>
+      </w:r>
+      <w:r>
+        <w:rPr>
+          <w:rFonts w:ascii="Arial" w:hAnsi="Arial" w:cs="Arial"/>
+          <w:lang w:val="el-GR"/>
+        </w:rPr>
+      </w:r>
+      <w:r>
+        <w:rPr>
+          <w:rFonts w:ascii="Arial" w:hAnsi="Arial" w:cs="Arial"/>
+          <w:lang w:val="el-GR"/>
+        </w:rPr>
+      </w:r>
+      <w:r>
+        <w:rPr>
+          <w:rFonts w:ascii="Arial" w:hAnsi="Arial" w:cs="Arial"/>
+          <w:lang w:val="el-GR"/>
+        </w:rPr>
+      </w:r>
+      <w:proofErr w:type="spellStart"/>
+      <w:r>
+        <w:rPr>
+          <w:rFonts w:ascii="Arial" w:hAnsi="Arial" w:cs="Arial"/>
+          <w:lang w:val="el-GR"/>
+        </w:rPr>
+      </w:r>
+      <w:proofErr w:type="spellEnd"/>
+      <w:r>
+        <w:rPr>
+          <w:rFonts w:ascii="Arial" w:hAnsi="Arial" w:cs="Arial"/>
+          <w:lang w:val="el-GR"/>
+        </w:rPr>
+      </w:r>
+      <w:r>
+        <w:rPr>
+          <w:rFonts w:ascii="Arial" w:hAnsi="Arial" w:cs="Arial"/>
+          <w:lang w:val="el-GR"/>
+        </w:rPr>
+      </w:r>
+      <w:r>
+        <w:rPr>
+          <w:rFonts w:ascii="Arial" w:hAnsi="Arial" w:cs="Arial"/>
+          <w:b/>
+          <w:lang w:val="el-GR"/>
+        </w:rPr>
+      </w:r>
+      <w:r>
+        <w:rPr>
+          <w:rFonts w:ascii="Arial" w:hAnsi="Arial" w:cs="Arial"/>
+          <w:b/>
+          <w:lang w:val="el-GR"/>
+        </w:rPr>
+      </w:r>
+      <w:r>
+        <w:rPr>
+          <w:rFonts w:ascii="Arial" w:hAnsi="Arial" w:cs="Arial"/>
+          <w:b/>
+          <w:lang w:val="el-GR"/>
+        </w:rPr>
+      </w:r>
+      <w:r>
+        <w:rPr>
+          <w:rFonts w:ascii="Arial" w:hAnsi="Arial" w:cs="Arial"/>
+          <w:b/>
+          <w:lang w:val="el-GR"/>
+        </w:rPr>
+      </w:r>
+      <w:r>
+        <w:rPr>
+          <w:rFonts w:ascii="Arial" w:hAnsi="Arial" w:cs="Arial"/>
+          <w:b/>
+          <w:lang w:val="el-GR"/>
+        </w:rPr>
+      </w:r>
+      <w:r>
+        <w:rPr>
+          <w:rFonts w:ascii="Arial" w:hAnsi="Arial" w:cs="Arial"/>
+          <w:b/>
+          <w:lang w:val="el-GR"/>
+        </w:rPr>
+      </w:r>
+      <w:r>
+        <w:rPr>
+          <w:rFonts w:ascii="Arial" w:hAnsi="Arial" w:cs="Arial"/>
+          <w:lang w:val="el-GR"/>
+        </w:rPr>
       </w:r>
     </w:p>
     <w:p>
@@ -4568,22 +4475,20 @@
           <w:rFonts w:ascii="Arial" w:hAnsi="Arial" w:cs="Arial"/>
           <w:lang w:val="el-GR"/>
         </w:rPr>
-        <w:t xml:space="preserve">Ο αριθμός Παροχής της ΔΕΗ είναι </w:t>
-      </w:r>
-      <w:r>
-        <w:rPr>
-          <w:rFonts w:ascii="Arial" w:hAnsi="Arial" w:cs="Arial"/>
-          <w:highlight w:val="yellow"/>
-          <w:lang w:val="el-GR"/>
-        </w:rPr>
-        <w:t>3138574</w:t>
-      </w:r>
-      <w:r>
-        <w:rPr>
-          <w:rFonts w:ascii="Arial" w:hAnsi="Arial" w:cs="Arial"/>
-          <w:lang w:val="el-GR"/>
-        </w:rPr>
-        <w:t xml:space="preserve">. Επίσης </w:t>
+        <w:t>Ο αριθμός Παροχής της ΔΕΗ είναι {{ property_deh_number }}.</w:t>
+      </w:r>
+      <w:r>
+        <w:rPr>
+          <w:rFonts w:ascii="Arial" w:hAnsi="Arial" w:cs="Arial"/>
+          <w:lang w:val="el-GR"/>
+        </w:rPr>
+      </w:r>
+      <w:r>
+        <w:rPr>
+          <w:rFonts w:ascii="Arial" w:hAnsi="Arial" w:cs="Arial"/>
+          <w:lang w:val="el-GR"/>
+        </w:rPr>
+        <w:t xml:space="preserve"> Επίσης </w:t>
       </w:r>
       <w:r>
         <w:rPr>
@@ -5975,7 +5880,7 @@
           <w:rFonts w:ascii="Arial" w:hAnsi="Arial" w:cs="Arial"/>
           <w:lang w:val="el-GR"/>
         </w:rPr>
-        <w:t>Σε πίστωση αυτών συντάχθηκε το παρόν και οι συμβαλλόμενοι το υπέγραψαν μέσω ηλεκτρονικού ταχυδρομείου.</w:t>
+        <w:t>Σε πίστωση αυτών συντάχθηκε το παρόν και οι συμβαλλόμενοι το υπέγραψαν{% if signed_electronically %} ηλεκτρονικά{% endif %}.</w:t>
       </w:r>
     </w:p>
     <w:p>

</xml_diff>